<commit_message>
feat: advance monitoring story
</commit_message>
<xml_diff>
--- a/manuscript/chapter-03-the-first-correction.docx
+++ b/manuscript/chapter-03-the-first-correction.docx
@@ -202,7 +202,7 @@
     </w:p>
     <w:p>
       <w:r>
-        <w:t>It had been running from Teresa's nose throughout the night. Her pillow was crimson. Elara shouted for her parents, and the household moved all at once: Voss calling the hospital, Vishnu lifting Teresa carefully from the bed, Elara standing in the doorway with red paint still dried beneath her fingernails.</w:t>
+        <w:t>It had been running from Teresa's nose throughout the night. Her pillow was crimson. Elara shouted for her parents, and the household moved all at once: Voss calling the hospital, Vishnu lifting Teresa carefully from the bed, Elara standing in the doorway with red paint from the unfinished sunset still staining her fingertips.</w:t>
       </w:r>
     </w:p>
     <w:p>
@@ -222,7 +222,17 @@
     </w:p>
     <w:p>
       <w:r>
-        <w:t>Elara became obsessed with saving Teresa. She read medical journals in every Trinity archive that would grant her access, then requested the ones that required a supervisor's approval. She learned the language of vascular disorders, tissue failure, neural pressure, and experimental intervention. She copied treatment protocols into notebooks and filled their margins with questions the journals did not answer. Why had no one recorded a case like Teresa's? Why did Trinity's physicians speak as though the limits of their knowledge were the limits of the world?</w:t>
+        <w:t>Elara became obsessed with saving Teresa because Teresa was getting worse. The transfusions bought her time, but each crisis left her weaker than before. The bleeding returned more often. Headaches that once passed in an afternoon kept her awake through the night. She began losing feeling in her fingers, stumbling when she walked, and pausing halfway through a sentence while she searched for a word that had once come easily. Some days she could still laugh and argue with Elara about a passage from an old book. Other days, lifting her head from the pillow seemed to exhaust everything she had.</w:t>
+      </w:r>
+    </w:p>
+    <w:p>
+      <w:r>
+        <w:t>Elara read medical journals in every Trinity archive that would grant her access, then requested the ones that required a supervisor's approval. She learned the language of vascular disorders, tissue failure, neural pressure, and experimental intervention. She copied treatment protocols into notebooks and filled their margins with questions the journals did not answer. Why had no one recorded a case like Teresa's? Why did Trinity's physicians speak as though the limits of their knowledge were the limits of the world?</w:t>
+      </w:r>
+    </w:p>
+    <w:p>
+      <w:r>
+        <w:t>In Vishnu's library, Elara found an old copy of the Ramayana and read about Sanjeevani booti, a legendary herb said to possess the power to restore life to someone believed to be dead. The story offered no medical proof, only a mountain, a plant, and an impossible promise. But Teresa's condition had made impossible promises feel worth investigating.</w:t>
       </w:r>
     </w:p>
     <w:p>
@@ -252,7 +262,7 @@
     </w:p>
     <w:p>
       <w:r>
-        <w:t>Vishnu's library was the only place left to search. He kept old books in a locked cabinet, not because they were forbidden, but because most people considered them useless. They contained legends of vanished cities, accounts of healers who understood the body through forces modern medicine could no longer measure, and stories of people who had crossed dead lands to find water, seeds, or knowledge that had been deliberately hidden.</w:t>
+        <w:t>Vishnu's library was the only place left to search. He kept the old books in a locked cabinet, not because they were forbidden, but because they were fragile, irreplaceable, and ignored by almost everyone in Trinity. They contained legends of vanished cities, accounts of healers who understood the body through forces modern medicine could no longer measure, and stories of people who had crossed dead lands to find water, seeds, or knowledge that had been deliberately hidden.</w:t>
       </w:r>
     </w:p>
     <w:p>
@@ -312,7 +322,7 @@
     </w:p>
     <w:p>
       <w:r>
-        <w:t>Teresa died in the hospital during the second night of Elara's absence. The transfusions had kept her alive for weeks, but they could not stop the hidden ruptures moving through her body. Voss and Vishnu were with her when she died. They had called Elara's name until the doctors made them leave the room.</w:t>
+        <w:t>Teresa died in the hospital during the second night of Elara's absence. The transfusions had kept her alive for weeks, but they could not stop the hidden ruptures moving through her body. Elara was the last name Teresa uttered before she passed into the same sunset Elara had been drawing the night of her first bleeding episode.</w:t>
       </w:r>
     </w:p>
     <w:p>
@@ -347,17 +357,17 @@
     </w:p>
     <w:p>
       <w:r>
-        <w:t>Her search changed the direction of her life. She no longer wanted knowledge merely to understand the world. She wanted it because someone she loved was suffering, and because the answers might exist in the places Trinity had taught everyone to dismiss. The watchers saw the hours she spent in restricted collections. Drona saw a student with unusual persistence. Elara saw only Teresa, waiting for a cure that no one had proved was impossible.</w:t>
+        <w:t>Her search changed the direction of her life. She no longer wanted knowledge merely to understand the world. She wanted it because someone she loved had suffered and died, and because the answers might exist in the places Trinity had taught everyone to dismiss. The watchers saw the hours she spent in restricted collections. Drona saw a student with unusual persistence. Elara carried Teresa's memory with her, refusing to accept that the cure had been impossible simply because Trinity had failed to find it.</w:t>
       </w:r>
     </w:p>
     <w:p>
       <w:r>
-        <w:t>At sixteen, they found an old educational archive that described Earth not as a dead origin point but as a living system. The record had been partially redacted, its images removed and its language reduced to approved summaries. Teresa wanted to report the missing material. Elara wanted to reconstruct it first. She used her art to restore what the archive had tried to flatten: not a paradise, but a world with more life, more danger, and more choices than Trinity's official history allowed.</w:t>
+        <w:t>At sixteen, Elara found an old educational archive that described Earth not as a dead origin point but as a living system. The record had been partially redacted, its images removed and its language reduced to approved summaries. She wanted to report the missing material, but she wanted even more to reconstruct it first. She used her art to restore what the archive had tried to flatten: not a paradise, but a world with more life, more danger, and more choices than Trinity's official history allowed.</w:t>
       </w:r>
     </w:p>
     <w:p>
       <w:r>
-        <w:t>The watchers noticed the difference before the judges did. Elara's images were not based on Trinity's view of the world, and they were not faithful to the world as it existed around her. They belonged to the world as it had been: grounded, permanent, and full of life that had not been arranged by a schedule or suspended above the clouds. The watchers marked the pattern as a deviation risk. Her drawings suggested that she could be content inside the world built for her while yearning for something older, something better, and possibly something real.</w:t>
+        <w:t>The watchers noticed the difference before the judges did. Elara's images were not based on Trinity's view of the world, and they were not faithful to the world as it existed around her. They belonged to the world as it had been: grounded, permanent, and full of life that had not been arranged by a schedule or suspended above the clouds. The watchers marked the pattern as a deviation risk. Her drawings suggested that she could function inside the world built for her, but would never be content there while yearning for something older, something better, and possibly something real.</w:t>
       </w:r>
     </w:p>
     <w:p>
@@ -387,7 +397,7 @@
     </w:p>
     <w:p>
       <w:r>
-        <w:t>Elara had built her entire career on not owing that debt again. She observed. She reported on schedule. She let the machine see everything before she decided what to feel about it, because feeling first had cost her the one person in that room who had ever looked at her like she mattered more than her scores.</w:t>
+        <w:t>Elara had built her entire career around a failure she could not outwork. All her care, love, empathy, struggle, and desperation had not saved Teresa. Worse, her desperation had carried her to the ground and kept her away when Teresa spoke her final word. After that, Elara learned to observe before acting, to report before intervening, and to let the machine see everything before she decided what to feel about it. No amount of discipline could change what she had lost, but discipline gave her a way to keep moving.</w:t>
       </w:r>
     </w:p>
     <w:p>

</xml_diff>

<commit_message>
Tighten Chapter 3 opening transition
</commit_message>
<xml_diff>
--- a/manuscript/chapter-03-the-first-correction.docx
+++ b/manuscript/chapter-03-the-first-correction.docx
@@ -20,7 +20,7 @@
     </w:p>
     <w:p>
       <w:r>
-        <w:t>At eighteen hours, the chamber had changed from restless to wrong. No candidate slept. The screens showed shaking hands, repeated movements, and pulse patterns rising without exertion. The design of the intake had already done what it was meant to do. Gage's group sat close enough that their heat signatures touched at the edges. They shared what they could and kept one another facing the same direction.</w:t>
+        <w:t>By the eighteen-hour mark, the system had flagged a new pattern. The chamber had changed from restless to wrong. No candidate slept. The screens showed shaking hands, repeated movements, and pulse patterns rising without exertion. The design of the intake had already done what it was meant to do. Gage's group sat close enough that their heat signatures touched at the edges. They shared what they could and kept one another facing the same direction.</w:t>
       </w:r>
     </w:p>
     <w:p>
@@ -46,6 +46,11 @@
     <w:p>
       <w:r>
         <w:t>Rohan did not look away from Otto's feed. "At twenty-four hours, the first real decisions begin. The force ladder remains closed unless there is an actual threat."</w:t>
+      </w:r>
+    </w:p>
+    <w:p>
+      <w:r>
+        <w:t>The next morning, the representatives settled back into their consoles for the first full reassessment of the intake cycle after the overnight deterioration.</w:t>
       </w:r>
     </w:p>
     <w:p>

</xml_diff>

<commit_message>
Add 24-to-36 hour bridge in Chapter 3
</commit_message>
<xml_diff>
--- a/manuscript/chapter-03-the-first-correction.docx
+++ b/manuscript/chapter-03-the-first-correction.docx
@@ -60,7 +60,12 @@
     </w:p>
     <w:p>
       <w:r>
-        <w:t>At thirty-six hours, the chamber feeds had stopped resembling a test and begun resembling an accounting of who could remain awake. Gage, Ben, and Otto still held to the same narrow proximity band. Elara had no authorized action to take, only readings that refused to separate them.</w:t>
+        <w:t>The next review window arrived without ceremony. The chamber had already crossed the point where fatigue could be dismissed as ordinary strain. The readings were still within Trinity's approved thresholds, but the pattern had become durable enough that no one could pretend it was temporary.</w:t>
+      </w:r>
+    </w:p>
+    <w:p>
+      <w:r>
+        <w:t>By thirty-six hours, the chamber feeds had stopped resembling a test and begun resembling an accounting of who could remain awake. Gage, Ben, and Otto still held to the same narrow proximity band. Elara had no authorized action to take, only readings that refused to separate them.</w:t>
       </w:r>
     </w:p>
     <w:p>

</xml_diff>

<commit_message>
Refine Teresa narrative arc, carbon dating, and Elara's vow in Chapter 03
</commit_message>
<xml_diff>
--- a/manuscript/chapter-03-the-first-correction.docx
+++ b/manuscript/chapter-03-the-first-correction.docx
@@ -11,11 +11,8 @@
       </w:r>
     </w:p>
     <w:p>
-      <w:pPr>
-        <w:pStyle w:val="Heading2"/>
-      </w:pPr>
       <w:r>
-        <w:t>Day One, continued: The Pattern Forms</w:t>
+        <w:t>## Day One, continued: The Pattern Forms</w:t>
       </w:r>
     </w:p>
     <w:p>
@@ -145,7 +142,7 @@
     </w:p>
     <w:p>
       <w:r>
-        <w:t>The Drona Foundational Institute did not call itself a school. It called itself a correction of inefficiency, the idea being that a child's mind, left alone, wasted most of what it was given. Elara had been assessed at four, tracked at six, and enrolled at eight, the same year her aptitude scores separated her from the rest of her creche and placed her in a room with eleven other children who had also been called promising.</w:t>
+        <w:t>The Drona Foundational Institute did not call itself a school. It called itself a correction of inefficiency, the idea being that a child's mind, left alone, wasted most of what it was given. Elara had been assessed at four, tracked at six, and enrolled at eight, the same year her aptitude scores separated her from the rest of her early-learning center and placed her in a room with eleven other children who had also been called promising.</w:t>
       </w:r>
     </w:p>
     <w:p>
@@ -170,7 +167,7 @@
     </w:p>
     <w:p>
       <w:r>
-        <w:t>Iris tried to help it first. She adjusted a strap the construct's own error-injection had deliberately tightened, three full minutes before the reporting window opened. The system flagged the deviation instantly. It did not care that the subject was not real. It cared that a child had chosen contact over compliance.</w:t>
+        <w:t>Iris waited until the reporting window opened and entered the construct's escalating readings exactly as required. Then she adjusted the strap its own error-injection had deliberately tightened. The system flagged the intervention immediately. It did not care that Iris had reported first, or that the subject was not real. She had understood the procedure and chosen contact over compliance anyway.</w:t>
       </w:r>
     </w:p>
     <w:p>
@@ -220,7 +217,12 @@
     </w:p>
     <w:p>
       <w:r>
-        <w:t>While Elara was learning what Trinity did to children who reached beyond their assigned limits, Teresa was flying through her own assessments. Her interest in everything old had become more focused. Ancient history led her to archaeology, archaeology led her to material analysis, and soon she was studying carbon dating and related methods for determining the age of organic remains. The field held real promise in Trinity. Every verified fragment could establish a timeline, test an official record, or prove that an object had existed before the city rose into the sky.</w:t>
+        <w:t xml:space="preserve">While Elara was learning what Trinity did to children who reached beyond their assigned limits, Teresa was flying through her own assessments. Her interest in everything old had become more focused. Ancient history led her to archaeology, archaeology led her to material analysis, and soon she was studying carbon dating and related methods for determining the age of organic remains. </w:t>
+      </w:r>
+    </w:p>
+    <w:p>
+      <w:r>
+        <w:t>To Trinity's administrators, the field was an essential instrument of institutional authority. The state relied on empirical methods to inventory ancient artifacts, standardize official timelines, and provide the scientific precision required to legitimize its historical narrative. But for Teresa, the discipline held a quieter, far more dangerous promise. Carbon dating relied on physical decay rather than state decree, offering an unalterable yardstick that censorship could not rewrite. In her hands, every verified organic fragment became a double-edged tool: one that could satisfy Drona's demand for precise cataloging while simultaneously testing the state's official records, proving whether an object had existed before the city rose into the sky, and exposing what Trinity had suppressed.</w:t>
       </w:r>
     </w:p>
     <w:p>
@@ -230,7 +232,7 @@
     </w:p>
     <w:p>
       <w:r>
-        <w:t>By fourteen, Elara and Teresa had become exemplary in their own ways, even as their interests pulled them in different directions. Elara shone in the arts: drawing, composition, color, and the patient work of making an invisible idea visible. Teresa was drawn toward origins. She read what remained of natural history, ancient cultures, and the records of Earth's first skies, then spent hours telling Elara what she had found.</w:t>
+        <w:t>By fourteen, Elara and Teresa had become exemplary in their own ways, even as their interests pulled them in different directions. Elara shone in the arts: drawing, composition, color, and the tedious work of making an invisible idea visible. Teresa was drawn toward origins. She read what remained of natural history, ancient cultures, and the records of Earth's first skies, then spent hours telling Elara what she had found.</w:t>
       </w:r>
     </w:p>
     <w:p>
@@ -265,7 +267,7 @@
     </w:p>
     <w:p>
       <w:r>
-        <w:t>The hospital found no familiar cause. Teresa's scans showed a rare systemic microvascular disorder, an instability in the smallest vessels that allowed capillaries to rupture without warning. Some of the bleeding had occurred in her nasal passages. Other ruptures were deeper, scattered through tissue the doctors could not safely reach. It was not a tumor they could remove or an infection they could treat. Trinity had no recorded precedent for it.</w:t>
+        <w:t>The doctors could describe what was happening inside Teresa's body, but they could not say what had set it in motion. Her scans showed a rare systemic microvascular disorder, an instability in the smallest vessels that allowed capillaries to rupture without warning. Some of the bleeding had occurred in her nasal passages. Other ruptures were deeper, scattered through tissue the doctors could not safely reach. It was not a tumor they could remove or an infection they could treat. Trinity had no recorded precedent for it.</w:t>
       </w:r>
     </w:p>
     <w:p>
@@ -295,7 +297,7 @@
     </w:p>
     <w:p>
       <w:r>
-        <w:t>When the journals gave her nothing more than variations of the same refusal, Elara began asking for permission to travel. She asked Vishnu and Voss first. Then she asked her teachers, Teresa's doctors, the elders who remembered more of Trinity's early years, and government officials whose offices controlled every route beyond the city. She showed them the passages about the mythical mountains and explained that the cure might be an extinct herb, a mistranslated medicine, or a truth buried beneath the legend.</w:t>
+        <w:t>When the journals gave her nothing more than variations of the same refusal, Elara began asking for permission to travel. She asked Vishnu and Voss first. Then she asked her teachers, Teresa's doctors, the elders who remembered more of Trinity's early years, and government officials whose offices controlled every route beyond the city. She showed them the passages about the mythical mountains and explained that the cure might be an almost extinct herb, a mistranslated medicine, or a truth buried beneath the legend.</w:t>
       </w:r>
     </w:p>
     <w:p>
@@ -320,32 +322,17 @@
     </w:p>
     <w:p>
       <w:r>
-        <w:t>Vishnu's library was the only place left to search. He kept the old books in a locked cabinet, not because they were forbidden, but because they were fragile, irreplaceable, and ignored by almost everyone in Trinity. They contained legends of vanished cities, accounts of healers who understood the body through forces modern medicine could no longer measure, and stories of people who had crossed dead lands to find water, seeds, or knowledge that had been deliberately hidden.</w:t>
+        <w:t>She returned to Vishnu’s locked cabinet with a different kind of urgency. Where she had once read the old texts for comfort or curiosity, she now interrogated them for specifics: botanical markers, ancient climate conditions, and trade routes that predated Trinity’s ascension. She no longer cared whether a story had been proven by Drona’s standards. A legend could be a distortion of truth, and a truth buried long enough could begin to look like legend.</w:t>
       </w:r>
     </w:p>
     <w:p>
       <w:r>
-        <w:t>Some of the books were clearly myths. Others were written in the careful language of eyewitnesses, filled with dates and place names that no Trinity archive recognized. A few described diseases that sounded uncomfortably like Teresa's, though the descriptions were wrapped in images of curses, broken stars, poisoned rivers, or invisible fire moving through the blood. Elara read all of them. She no longer cared whether a story had been proven. A legend could be a distortion of truth, and a truth buried long enough could begin to look like legend.</w:t>
+        <w:t>She began copying every detail of Sanjeevani booti into a separate notebook—its reported scent, its luminosity, the elevation where it was said to thrive, and the signs by which it could be recognized. She cross-referenced the text with botanical records and the uncensored fragments of old-world natural history. The search was irrational by every standard Trinity had taught her, which was precisely why it felt more honest than waiting for another physician to report another decline.</w:t>
       </w:r>
     </w:p>
     <w:p>
       <w:r>
-        <w:t>The story that held her was the Ramayana. Vishnu's copy was old enough that the pages had softened at the edges, and the section about Sanjeevani booti had been marked by generations of hands. The herb was said to possess such power that it could restore life to someone believed to be dead. The story did not explain the medicine in the language of cellular repair or vascular stability. It gave the cure a name, a mountain, and an impossible promise.</w:t>
-      </w:r>
-    </w:p>
-    <w:p>
-      <w:r>
-        <w:t>No one could prove that Sanjeevani booti had ever existed. It might have been a medicinal plant whose properties had been exaggerated across centuries. It might have been an extinct species, lost when the old world was damaged. It might never have existed at all. Elara accepted every possibility except the one in which she stopped looking.</w:t>
-      </w:r>
-    </w:p>
-    <w:p>
-      <w:r>
-        <w:t>She began copying every description of the herb into a separate notebook: its scent, its light, the places it was said to grow, the signs by which it could be recognized. She compared the legend with botanical records and with the fragments of medical history Trinity had left uncensored. The search was irrational by every standard she had been taught, which was precisely why it felt more honest than waiting for another physician to tell her there was nothing more to try.</w:t>
-      </w:r>
-    </w:p>
-    <w:p>
-      <w:r>
-        <w:t>Teresa laughed when Elara first showed her the notebook. Then the laughter faded, because Elara was not pretending. They were teenagers, and their friendship had deepened into the kind of devotion that could make an extinct herb feel closer than a hospital bed. Elara would cross a dead world, climb a mountain, or search through a thousand false histories if there were even the smallest chance that Sanjeevani booti was real.</w:t>
+        <w:t>Teresa laughed when Elara first showed her the notebook. Then the laughter faded, because Elara was not pretending. They were teenagers, and their friendship had deepened into the kind of devotion that could make an almost extinct herb feel closer than a hospital bed. Elara would cross a dead world, climb a mountain, or search through a thousand false histories if there were even the smallest chance that Sanjeevani booti was real.</w:t>
       </w:r>
     </w:p>
     <w:p>
@@ -405,7 +392,7 @@
     </w:p>
     <w:p>
       <w:r>
-        <w:t>She swore that one day she would close the gap between those who had and those who had not. She did not yet know whether that would require medicine, reform, access to the old world, or a more dangerous kind of intervention. She only knew that Trinity's safety was built on a suffering it had taught its people not to name.</w:t>
+        <w:t>The vow settled inside Elara not as aimless anger, but as a clear, devastating clarity. Teresa had not died simply because medicine had failed; she had died because Trinity had deliberately severed the trunk of its civilization from its roots. By floating into the sky and resetting the historical clock to zero, the ruling elites had locked away the past, abandoned the ground, and hoarded opportunity—hoarding comfort for themselves while leaving Miner Town to pay the cost in sweat and soot. They had chosen controlled privilege over collective excellence. Elara realized that if Trinity had not cut itself off from old-world knowledge and suppressed equal talent across all tiers, scientific and medical progress would have advanced far enough to save Teresa. The state had built its safety by teaching its people to accept artificial limits. Elara swore she would undo that injustice: she would reconnect the trunk to its roots, reclaim the suppressed past, and force Trinity to confront the truth that true progress required an equal chance for every life beneath the sky.</w:t>
       </w:r>
     </w:p>
     <w:p>

</xml_diff>